<commit_message>
fix MCMC and numbers
</commit_message>
<xml_diff>
--- a/docs/blog/Four-post.docx
+++ b/docs/blog/Four-post.docx
@@ -2104,7 +2104,7 @@
         <w:rPr>
           <w:rStyle w:val="NormalTok"/>
         </w:rPr>
-        <w:t xml:space="preserve">n_valid   </w:t>
+        <w:t xml:space="preserve">n_valid </w:t>
       </w:r>
       <w:r>
         <w:rPr>
@@ -2269,7 +2269,7 @@
         <w:rPr>
           <w:rStyle w:val="NormalTok"/>
         </w:rPr>
-        <w:t xml:space="preserve">n_total   </w:t>
+        <w:t xml:space="preserve">n_total </w:t>
       </w:r>
       <w:r>
         <w:rPr>
@@ -2509,7 +2509,7 @@
         <w:rPr>
           <w:rStyle w:val="CommentTok"/>
         </w:rPr>
-        <w:t xml:space="preserve"># Keep only tasks that are structurally complete (exactly 1 best, 1 worst, 2 neutral)</w:t>
+        <w:t xml:space="preserve"># Keep only tasks that are structurally complete</w:t>
       </w:r>
       <w:r>
         <w:br/>
@@ -7528,7 +7528,7 @@
         <w:pStyle w:val="BodyText"/>
       </w:pPr>
       <w:r>
-        <w:t xml:space="preserve">The chart reveals a clear preference hierarchy. MGTA 495 Marketing Analytics ranks at the top by a wide margin (score = 0.567), while MGTA 444 Analytics Consulting ranks at the bottom (score = −0.155). The confidence intervals for the top and bottom items do not overlap with those in the middle, confirming these rankings are not driven by chance.</w:t>
+        <w:t xml:space="preserve">The chart reveals a clear preference hierarchy. MGTA 495 Marketing Analytics ranks at the top by a wide margin (score = 0.493), while MGTA 444 Analytics Consulting ranks at the bottom (score = −0.292). The confidence intervals for the top and bottom items do not overlap with those in the middle, confirming these rankings are not driven by chance.</w:t>
       </w:r>
     </w:p>
     <w:bookmarkEnd w:id="14"/>
@@ -12730,7 +12730,7 @@
         <w:pStyle w:val="BodyText"/>
       </w:pPr>
       <w:r>
-        <w:t xml:space="preserve">The MLE ranking closely mirrors the counts analysis — MGTA 495 Marketing Analytics is the most preferred class by a large margin, and MGTA 444 Analytics Consulting is the least preferred. Differences from the counts analysis appear in the middle tier, where the MNL makes more efficient use of the data: every task where an item was</w:t>
+        <w:t xml:space="preserve">The MLE ranking closely mirrors the counts analysis — MGTA 495 Marketing Analytics is the most preferred class by a large margin (share = 0.2839), and MGTA 444 Analytics Consulting is the least preferred (share = 0.0438). Differences from the counts analysis appear in the middle tier, where the MNL makes more efficient use of the data: every task where an item was</w:t>
       </w:r>
       <w:r>
         <w:t xml:space="preserve"> </w:t>
@@ -13938,13 +13938,19 @@
         <w:rPr>
           <w:rStyle w:val="FloatTok"/>
         </w:rPr>
-        <w:t xml:space="preserve">0.8</w:t>
-      </w:r>
-      <w:r>
-        <w:rPr>
-          <w:rStyle w:val="NormalTok"/>
-        </w:rPr>
-        <w:t xml:space="preserve">,</w:t>
+        <w:t xml:space="preserve">0.15</w:t>
+      </w:r>
+      <w:r>
+        <w:rPr>
+          <w:rStyle w:val="NormalTok"/>
+        </w:rPr>
+        <w:t xml:space="preserve">,      </w:t>
+      </w:r>
+      <w:r>
+        <w:rPr>
+          <w:rStyle w:val="CommentTok"/>
+        </w:rPr>
+        <w:t xml:space="preserve"># tuned for ~25-40% acceptance rate</w:t>
       </w:r>
       <w:r>
         <w:br/>
@@ -14096,7 +14102,7 @@
         <w:rPr>
           <w:rStyle w:val="VerbatimChar"/>
         </w:rPr>
-        <w:t xml:space="preserve">Acceptance rate: 0 %</w:t>
+        <w:t xml:space="preserve">Acceptance rate: 6.2 %</w:t>
       </w:r>
     </w:p>
     <w:p>
@@ -16042,13 +16048,13 @@
         <w:tblCaption w:val="Bayesian estimates: posterior mean, 95% credible interval, posterior mean share"/>
       </w:tblPr>
       <w:tblGrid>
-        <w:gridCol w:w="220"/>
-        <w:gridCol w:w="366"/>
-        <w:gridCol w:w="5060"/>
-        <w:gridCol w:w="733"/>
-        <w:gridCol w:w="513"/>
-        <w:gridCol w:w="513"/>
-        <w:gridCol w:w="513"/>
+        <w:gridCol w:w="222"/>
+        <w:gridCol w:w="370"/>
+        <w:gridCol w:w="5107"/>
+        <w:gridCol w:w="740"/>
+        <w:gridCol w:w="518"/>
+        <w:gridCol w:w="444"/>
+        <w:gridCol w:w="518"/>
       </w:tblGrid>
       <w:tr>
         <w:trPr>
@@ -16180,43 +16186,43 @@
               <w:jc w:val="right"/>
             </w:pPr>
             <w:r>
-              <w:t xml:space="preserve">1.630</w:t>
-            </w:r>
-          </w:p>
-        </w:tc>
-        <w:tc>
-          <w:tcPr/>
-          <w:p>
-            <w:pPr>
-              <w:pStyle w:val="Compact"/>
-              <w:jc w:val="right"/>
-            </w:pPr>
-            <w:r>
-              <w:t xml:space="preserve">1.630</w:t>
-            </w:r>
-          </w:p>
-        </w:tc>
-        <w:tc>
-          <w:tcPr/>
-          <w:p>
-            <w:pPr>
-              <w:pStyle w:val="Compact"/>
-              <w:jc w:val="right"/>
-            </w:pPr>
-            <w:r>
-              <w:t xml:space="preserve">1.630</w:t>
-            </w:r>
-          </w:p>
-        </w:tc>
-        <w:tc>
-          <w:tcPr/>
-          <w:p>
-            <w:pPr>
-              <w:pStyle w:val="Compact"/>
-              <w:jc w:val="right"/>
-            </w:pPr>
-            <w:r>
-              <w:t xml:space="preserve">0.2839</w:t>
+              <w:t xml:space="preserve">1.619</w:t>
+            </w:r>
+          </w:p>
+        </w:tc>
+        <w:tc>
+          <w:tcPr/>
+          <w:p>
+            <w:pPr>
+              <w:pStyle w:val="Compact"/>
+              <w:jc w:val="right"/>
+            </w:pPr>
+            <w:r>
+              <w:t xml:space="preserve">1.321</w:t>
+            </w:r>
+          </w:p>
+        </w:tc>
+        <w:tc>
+          <w:tcPr/>
+          <w:p>
+            <w:pPr>
+              <w:pStyle w:val="Compact"/>
+              <w:jc w:val="right"/>
+            </w:pPr>
+            <w:r>
+              <w:t xml:space="preserve">1.958</w:t>
+            </w:r>
+          </w:p>
+        </w:tc>
+        <w:tc>
+          <w:tcPr/>
+          <w:p>
+            <w:pPr>
+              <w:pStyle w:val="Compact"/>
+              <w:jc w:val="right"/>
+            </w:pPr>
+            <w:r>
+              <w:t xml:space="preserve">0.2847</w:t>
             </w:r>
           </w:p>
         </w:tc>
@@ -16266,43 +16272,43 @@
               <w:jc w:val="right"/>
             </w:pPr>
             <w:r>
-              <w:t xml:space="preserve">0.744</w:t>
-            </w:r>
-          </w:p>
-        </w:tc>
-        <w:tc>
-          <w:tcPr/>
-          <w:p>
-            <w:pPr>
-              <w:pStyle w:val="Compact"/>
-              <w:jc w:val="right"/>
-            </w:pPr>
-            <w:r>
-              <w:t xml:space="preserve">0.744</w:t>
-            </w:r>
-          </w:p>
-        </w:tc>
-        <w:tc>
-          <w:tcPr/>
-          <w:p>
-            <w:pPr>
-              <w:pStyle w:val="Compact"/>
-              <w:jc w:val="right"/>
-            </w:pPr>
-            <w:r>
-              <w:t xml:space="preserve">0.744</w:t>
-            </w:r>
-          </w:p>
-        </w:tc>
-        <w:tc>
-          <w:tcPr/>
-          <w:p>
-            <w:pPr>
-              <w:pStyle w:val="Compact"/>
-              <w:jc w:val="right"/>
-            </w:pPr>
-            <w:r>
-              <w:t xml:space="preserve">0.1171</w:t>
+              <w:t xml:space="preserve">0.737</w:t>
+            </w:r>
+          </w:p>
+        </w:tc>
+        <w:tc>
+          <w:tcPr/>
+          <w:p>
+            <w:pPr>
+              <w:pStyle w:val="Compact"/>
+              <w:jc w:val="right"/>
+            </w:pPr>
+            <w:r>
+              <w:t xml:space="preserve">0.425</w:t>
+            </w:r>
+          </w:p>
+        </w:tc>
+        <w:tc>
+          <w:tcPr/>
+          <w:p>
+            <w:pPr>
+              <w:pStyle w:val="Compact"/>
+              <w:jc w:val="right"/>
+            </w:pPr>
+            <w:r>
+              <w:t xml:space="preserve">1.025</w:t>
+            </w:r>
+          </w:p>
+        </w:tc>
+        <w:tc>
+          <w:tcPr/>
+          <w:p>
+            <w:pPr>
+              <w:pStyle w:val="Compact"/>
+              <w:jc w:val="right"/>
+            </w:pPr>
+            <w:r>
+              <w:t xml:space="preserve">0.1179</w:t>
             </w:r>
           </w:p>
         </w:tc>
@@ -16352,43 +16358,43 @@
               <w:jc w:val="right"/>
             </w:pPr>
             <w:r>
-              <w:t xml:space="preserve">0.656</w:t>
-            </w:r>
-          </w:p>
-        </w:tc>
-        <w:tc>
-          <w:tcPr/>
-          <w:p>
-            <w:pPr>
-              <w:pStyle w:val="Compact"/>
-              <w:jc w:val="right"/>
-            </w:pPr>
-            <w:r>
-              <w:t xml:space="preserve">0.656</w:t>
-            </w:r>
-          </w:p>
-        </w:tc>
-        <w:tc>
-          <w:tcPr/>
-          <w:p>
-            <w:pPr>
-              <w:pStyle w:val="Compact"/>
-              <w:jc w:val="right"/>
-            </w:pPr>
-            <w:r>
-              <w:t xml:space="preserve">0.656</w:t>
-            </w:r>
-          </w:p>
-        </w:tc>
-        <w:tc>
-          <w:tcPr/>
-          <w:p>
-            <w:pPr>
-              <w:pStyle w:val="Compact"/>
-              <w:jc w:val="right"/>
-            </w:pPr>
-            <w:r>
-              <w:t xml:space="preserve">0.1072</w:t>
+              <w:t xml:space="preserve">0.636</w:t>
+            </w:r>
+          </w:p>
+        </w:tc>
+        <w:tc>
+          <w:tcPr/>
+          <w:p>
+            <w:pPr>
+              <w:pStyle w:val="Compact"/>
+              <w:jc w:val="right"/>
+            </w:pPr>
+            <w:r>
+              <w:t xml:space="preserve">0.342</w:t>
+            </w:r>
+          </w:p>
+        </w:tc>
+        <w:tc>
+          <w:tcPr/>
+          <w:p>
+            <w:pPr>
+              <w:pStyle w:val="Compact"/>
+              <w:jc w:val="right"/>
+            </w:pPr>
+            <w:r>
+              <w:t xml:space="preserve">0.941</w:t>
+            </w:r>
+          </w:p>
+        </w:tc>
+        <w:tc>
+          <w:tcPr/>
+          <w:p>
+            <w:pPr>
+              <w:pStyle w:val="Compact"/>
+              <w:jc w:val="right"/>
+            </w:pPr>
+            <w:r>
+              <w:t xml:space="preserve">0.1066</w:t>
             </w:r>
           </w:p>
         </w:tc>
@@ -16438,43 +16444,43 @@
               <w:jc w:val="right"/>
             </w:pPr>
             <w:r>
-              <w:t xml:space="preserve">0.555</w:t>
-            </w:r>
-          </w:p>
-        </w:tc>
-        <w:tc>
-          <w:tcPr/>
-          <w:p>
-            <w:pPr>
-              <w:pStyle w:val="Compact"/>
-              <w:jc w:val="right"/>
-            </w:pPr>
-            <w:r>
-              <w:t xml:space="preserve">0.555</w:t>
-            </w:r>
-          </w:p>
-        </w:tc>
-        <w:tc>
-          <w:tcPr/>
-          <w:p>
-            <w:pPr>
-              <w:pStyle w:val="Compact"/>
-              <w:jc w:val="right"/>
-            </w:pPr>
-            <w:r>
-              <w:t xml:space="preserve">0.555</w:t>
-            </w:r>
-          </w:p>
-        </w:tc>
-        <w:tc>
-          <w:tcPr/>
-          <w:p>
-            <w:pPr>
-              <w:pStyle w:val="Compact"/>
-              <w:jc w:val="right"/>
-            </w:pPr>
-            <w:r>
-              <w:t xml:space="preserve">0.0969</w:t>
+              <w:t xml:space="preserve">0.535</w:t>
+            </w:r>
+          </w:p>
+        </w:tc>
+        <w:tc>
+          <w:tcPr/>
+          <w:p>
+            <w:pPr>
+              <w:pStyle w:val="Compact"/>
+              <w:jc w:val="right"/>
+            </w:pPr>
+            <w:r>
+              <w:t xml:space="preserve">0.245</w:t>
+            </w:r>
+          </w:p>
+        </w:tc>
+        <w:tc>
+          <w:tcPr/>
+          <w:p>
+            <w:pPr>
+              <w:pStyle w:val="Compact"/>
+              <w:jc w:val="right"/>
+            </w:pPr>
+            <w:r>
+              <w:t xml:space="preserve">0.853</w:t>
+            </w:r>
+          </w:p>
+        </w:tc>
+        <w:tc>
+          <w:tcPr/>
+          <w:p>
+            <w:pPr>
+              <w:pStyle w:val="Compact"/>
+              <w:jc w:val="right"/>
+            </w:pPr>
+            <w:r>
+              <w:t xml:space="preserve">0.0964</w:t>
             </w:r>
           </w:p>
         </w:tc>
@@ -16488,19 +16494,19 @@
               <w:jc w:val="left"/>
             </w:pPr>
             <w:r>
-              <w:t xml:space="preserve">8</w:t>
-            </w:r>
-          </w:p>
-        </w:tc>
-        <w:tc>
-          <w:tcPr/>
-          <w:p>
-            <w:pPr>
-              <w:pStyle w:val="Compact"/>
-              <w:jc w:val="right"/>
-            </w:pPr>
-            <w:r>
-              <w:t xml:space="preserve">8</w:t>
+              <w:t xml:space="preserve">2</w:t>
+            </w:r>
+          </w:p>
+        </w:tc>
+        <w:tc>
+          <w:tcPr/>
+          <w:p>
+            <w:pPr>
+              <w:pStyle w:val="Compact"/>
+              <w:jc w:val="right"/>
+            </w:pPr>
+            <w:r>
+              <w:t xml:space="preserve">2</w:t>
             </w:r>
           </w:p>
         </w:tc>
@@ -16512,55 +16518,55 @@
               <w:jc w:val="left"/>
             </w:pPr>
             <w:r>
-              <w:t xml:space="preserve">MGTA 454 Capstone Project (Spring with Advisor)</w:t>
-            </w:r>
-          </w:p>
-        </w:tc>
-        <w:tc>
-          <w:tcPr/>
-          <w:p>
-            <w:pPr>
-              <w:pStyle w:val="Compact"/>
-              <w:jc w:val="right"/>
-            </w:pPr>
-            <w:r>
-              <w:t xml:space="preserve">0.443</w:t>
-            </w:r>
-          </w:p>
-        </w:tc>
-        <w:tc>
-          <w:tcPr/>
-          <w:p>
-            <w:pPr>
-              <w:pStyle w:val="Compact"/>
-              <w:jc w:val="right"/>
-            </w:pPr>
-            <w:r>
-              <w:t xml:space="preserve">0.443</w:t>
-            </w:r>
-          </w:p>
-        </w:tc>
-        <w:tc>
-          <w:tcPr/>
-          <w:p>
-            <w:pPr>
-              <w:pStyle w:val="Compact"/>
-              <w:jc w:val="right"/>
-            </w:pPr>
-            <w:r>
-              <w:t xml:space="preserve">0.443</w:t>
-            </w:r>
-          </w:p>
-        </w:tc>
-        <w:tc>
-          <w:tcPr/>
-          <w:p>
-            <w:pPr>
-              <w:pStyle w:val="Compact"/>
-              <w:jc w:val="right"/>
-            </w:pPr>
-            <w:r>
-              <w:t xml:space="preserve">0.0867</w:t>
+              <w:t xml:space="preserve">MGTA 464 SQL (Summer with Nijs)</w:t>
+            </w:r>
+          </w:p>
+        </w:tc>
+        <w:tc>
+          <w:tcPr/>
+          <w:p>
+            <w:pPr>
+              <w:pStyle w:val="Compact"/>
+              <w:jc w:val="right"/>
+            </w:pPr>
+            <w:r>
+              <w:t xml:space="preserve">0.425</w:t>
+            </w:r>
+          </w:p>
+        </w:tc>
+        <w:tc>
+          <w:tcPr/>
+          <w:p>
+            <w:pPr>
+              <w:pStyle w:val="Compact"/>
+              <w:jc w:val="right"/>
+            </w:pPr>
+            <w:r>
+              <w:t xml:space="preserve">0.170</w:t>
+            </w:r>
+          </w:p>
+        </w:tc>
+        <w:tc>
+          <w:tcPr/>
+          <w:p>
+            <w:pPr>
+              <w:pStyle w:val="Compact"/>
+              <w:jc w:val="right"/>
+            </w:pPr>
+            <w:r>
+              <w:t xml:space="preserve">0.718</w:t>
+            </w:r>
+          </w:p>
+        </w:tc>
+        <w:tc>
+          <w:tcPr/>
+          <w:p>
+            <w:pPr>
+              <w:pStyle w:val="Compact"/>
+              <w:jc w:val="right"/>
+            </w:pPr>
+            <w:r>
+              <w:t xml:space="preserve">0.0863</w:t>
             </w:r>
           </w:p>
         </w:tc>
@@ -16574,19 +16580,19 @@
               <w:jc w:val="left"/>
             </w:pPr>
             <w:r>
-              <w:t xml:space="preserve">2</w:t>
-            </w:r>
-          </w:p>
-        </w:tc>
-        <w:tc>
-          <w:tcPr/>
-          <w:p>
-            <w:pPr>
-              <w:pStyle w:val="Compact"/>
-              <w:jc w:val="right"/>
-            </w:pPr>
-            <w:r>
-              <w:t xml:space="preserve">2</w:t>
+              <w:t xml:space="preserve">8</w:t>
+            </w:r>
+          </w:p>
+        </w:tc>
+        <w:tc>
+          <w:tcPr/>
+          <w:p>
+            <w:pPr>
+              <w:pStyle w:val="Compact"/>
+              <w:jc w:val="right"/>
+            </w:pPr>
+            <w:r>
+              <w:t xml:space="preserve">8</w:t>
             </w:r>
           </w:p>
         </w:tc>
@@ -16598,55 +16604,55 @@
               <w:jc w:val="left"/>
             </w:pPr>
             <w:r>
-              <w:t xml:space="preserve">MGTA 464 SQL (Summer with Nijs)</w:t>
-            </w:r>
-          </w:p>
-        </w:tc>
-        <w:tc>
-          <w:tcPr/>
-          <w:p>
-            <w:pPr>
-              <w:pStyle w:val="Compact"/>
-              <w:jc w:val="right"/>
-            </w:pPr>
-            <w:r>
-              <w:t xml:space="preserve">0.438</w:t>
-            </w:r>
-          </w:p>
-        </w:tc>
-        <w:tc>
-          <w:tcPr/>
-          <w:p>
-            <w:pPr>
-              <w:pStyle w:val="Compact"/>
-              <w:jc w:val="right"/>
-            </w:pPr>
-            <w:r>
-              <w:t xml:space="preserve">0.438</w:t>
-            </w:r>
-          </w:p>
-        </w:tc>
-        <w:tc>
-          <w:tcPr/>
-          <w:p>
-            <w:pPr>
-              <w:pStyle w:val="Compact"/>
-              <w:jc w:val="right"/>
-            </w:pPr>
-            <w:r>
-              <w:t xml:space="preserve">0.438</w:t>
-            </w:r>
-          </w:p>
-        </w:tc>
-        <w:tc>
-          <w:tcPr/>
-          <w:p>
-            <w:pPr>
-              <w:pStyle w:val="Compact"/>
-              <w:jc w:val="right"/>
-            </w:pPr>
-            <w:r>
-              <w:t xml:space="preserve">0.0862</w:t>
+              <w:t xml:space="preserve">MGTA 454 Capstone Project (Spring with Advisor)</w:t>
+            </w:r>
+          </w:p>
+        </w:tc>
+        <w:tc>
+          <w:tcPr/>
+          <w:p>
+            <w:pPr>
+              <w:pStyle w:val="Compact"/>
+              <w:jc w:val="right"/>
+            </w:pPr>
+            <w:r>
+              <w:t xml:space="preserve">0.419</w:t>
+            </w:r>
+          </w:p>
+        </w:tc>
+        <w:tc>
+          <w:tcPr/>
+          <w:p>
+            <w:pPr>
+              <w:pStyle w:val="Compact"/>
+              <w:jc w:val="right"/>
+            </w:pPr>
+            <w:r>
+              <w:t xml:space="preserve">0.163</w:t>
+            </w:r>
+          </w:p>
+        </w:tc>
+        <w:tc>
+          <w:tcPr/>
+          <w:p>
+            <w:pPr>
+              <w:pStyle w:val="Compact"/>
+              <w:jc w:val="right"/>
+            </w:pPr>
+            <w:r>
+              <w:t xml:space="preserve">0.719</w:t>
+            </w:r>
+          </w:p>
+        </w:tc>
+        <w:tc>
+          <w:tcPr/>
+          <w:p>
+            <w:pPr>
+              <w:pStyle w:val="Compact"/>
+              <w:jc w:val="right"/>
+            </w:pPr>
+            <w:r>
+              <w:t xml:space="preserve">0.0859</w:t>
             </w:r>
           </w:p>
         </w:tc>
@@ -16696,43 +16702,43 @@
               <w:jc w:val="right"/>
             </w:pPr>
             <w:r>
-              <w:t xml:space="preserve">0.236</w:t>
-            </w:r>
-          </w:p>
-        </w:tc>
-        <w:tc>
-          <w:tcPr/>
-          <w:p>
-            <w:pPr>
-              <w:pStyle w:val="Compact"/>
-              <w:jc w:val="right"/>
-            </w:pPr>
-            <w:r>
-              <w:t xml:space="preserve">0.236</w:t>
-            </w:r>
-          </w:p>
-        </w:tc>
-        <w:tc>
-          <w:tcPr/>
-          <w:p>
-            <w:pPr>
-              <w:pStyle w:val="Compact"/>
-              <w:jc w:val="right"/>
-            </w:pPr>
-            <w:r>
-              <w:t xml:space="preserve">0.236</w:t>
-            </w:r>
-          </w:p>
-        </w:tc>
-        <w:tc>
-          <w:tcPr/>
-          <w:p>
-            <w:pPr>
-              <w:pStyle w:val="Compact"/>
-              <w:jc w:val="right"/>
-            </w:pPr>
-            <w:r>
-              <w:t xml:space="preserve">0.0704</w:t>
+              <w:t xml:space="preserve">0.211</w:t>
+            </w:r>
+          </w:p>
+        </w:tc>
+        <w:tc>
+          <w:tcPr/>
+          <w:p>
+            <w:pPr>
+              <w:pStyle w:val="Compact"/>
+              <w:jc w:val="right"/>
+            </w:pPr>
+            <w:r>
+              <w:t xml:space="preserve">-0.048</w:t>
+            </w:r>
+          </w:p>
+        </w:tc>
+        <w:tc>
+          <w:tcPr/>
+          <w:p>
+            <w:pPr>
+              <w:pStyle w:val="Compact"/>
+              <w:jc w:val="right"/>
+            </w:pPr>
+            <w:r>
+              <w:t xml:space="preserve">0.488</w:t>
+            </w:r>
+          </w:p>
+        </w:tc>
+        <w:tc>
+          <w:tcPr/>
+          <w:p>
+            <w:pPr>
+              <w:pStyle w:val="Compact"/>
+              <w:jc w:val="right"/>
+            </w:pPr>
+            <w:r>
+              <w:t xml:space="preserve">0.0698</w:t>
             </w:r>
           </w:p>
         </w:tc>
@@ -16818,7 +16824,7 @@
               <w:jc w:val="right"/>
             </w:pPr>
             <w:r>
-              <w:t xml:space="preserve">0.0556</w:t>
+              <w:t xml:space="preserve">0.0565</w:t>
             </w:r>
           </w:p>
         </w:tc>
@@ -16868,43 +16874,43 @@
               <w:jc w:val="right"/>
             </w:pPr>
             <w:r>
-              <w:t xml:space="preserve">-0.067</w:t>
-            </w:r>
-          </w:p>
-        </w:tc>
-        <w:tc>
-          <w:tcPr/>
-          <w:p>
-            <w:pPr>
-              <w:pStyle w:val="Compact"/>
-              <w:jc w:val="right"/>
-            </w:pPr>
-            <w:r>
-              <w:t xml:space="preserve">-0.067</w:t>
-            </w:r>
-          </w:p>
-        </w:tc>
-        <w:tc>
-          <w:tcPr/>
-          <w:p>
-            <w:pPr>
-              <w:pStyle w:val="Compact"/>
-              <w:jc w:val="right"/>
-            </w:pPr>
-            <w:r>
-              <w:t xml:space="preserve">-0.067</w:t>
-            </w:r>
-          </w:p>
-        </w:tc>
-        <w:tc>
-          <w:tcPr/>
-          <w:p>
-            <w:pPr>
-              <w:pStyle w:val="Compact"/>
-              <w:jc w:val="right"/>
-            </w:pPr>
-            <w:r>
-              <w:t xml:space="preserve">0.0520</w:t>
+              <w:t xml:space="preserve">-0.077</w:t>
+            </w:r>
+          </w:p>
+        </w:tc>
+        <w:tc>
+          <w:tcPr/>
+          <w:p>
+            <w:pPr>
+              <w:pStyle w:val="Compact"/>
+              <w:jc w:val="right"/>
+            </w:pPr>
+            <w:r>
+              <w:t xml:space="preserve">-0.355</w:t>
+            </w:r>
+          </w:p>
+        </w:tc>
+        <w:tc>
+          <w:tcPr/>
+          <w:p>
+            <w:pPr>
+              <w:pStyle w:val="Compact"/>
+              <w:jc w:val="right"/>
+            </w:pPr>
+            <w:r>
+              <w:t xml:space="preserve">0.191</w:t>
+            </w:r>
+          </w:p>
+        </w:tc>
+        <w:tc>
+          <w:tcPr/>
+          <w:p>
+            <w:pPr>
+              <w:pStyle w:val="Compact"/>
+              <w:jc w:val="right"/>
+            </w:pPr>
+            <w:r>
+              <w:t xml:space="preserve">0.0523</w:t>
             </w:r>
           </w:p>
         </w:tc>
@@ -16954,43 +16960,43 @@
               <w:jc w:val="right"/>
             </w:pPr>
             <w:r>
-              <w:t xml:space="preserve">-0.239</w:t>
-            </w:r>
-          </w:p>
-        </w:tc>
-        <w:tc>
-          <w:tcPr/>
-          <w:p>
-            <w:pPr>
-              <w:pStyle w:val="Compact"/>
-              <w:jc w:val="right"/>
-            </w:pPr>
-            <w:r>
-              <w:t xml:space="preserve">-0.239</w:t>
-            </w:r>
-          </w:p>
-        </w:tc>
-        <w:tc>
-          <w:tcPr/>
-          <w:p>
-            <w:pPr>
-              <w:pStyle w:val="Compact"/>
-              <w:jc w:val="right"/>
-            </w:pPr>
-            <w:r>
-              <w:t xml:space="preserve">-0.239</w:t>
-            </w:r>
-          </w:p>
-        </w:tc>
-        <w:tc>
-          <w:tcPr/>
-          <w:p>
-            <w:pPr>
-              <w:pStyle w:val="Compact"/>
-              <w:jc w:val="right"/>
-            </w:pPr>
-            <w:r>
-              <w:t xml:space="preserve">0.0438</w:t>
+              <w:t xml:space="preserve">-0.261</w:t>
+            </w:r>
+          </w:p>
+        </w:tc>
+        <w:tc>
+          <w:tcPr/>
+          <w:p>
+            <w:pPr>
+              <w:pStyle w:val="Compact"/>
+              <w:jc w:val="right"/>
+            </w:pPr>
+            <w:r>
+              <w:t xml:space="preserve">-0.535</w:t>
+            </w:r>
+          </w:p>
+        </w:tc>
+        <w:tc>
+          <w:tcPr/>
+          <w:p>
+            <w:pPr>
+              <w:pStyle w:val="Compact"/>
+              <w:jc w:val="right"/>
+            </w:pPr>
+            <w:r>
+              <w:t xml:space="preserve">0.026</w:t>
+            </w:r>
+          </w:p>
+        </w:tc>
+        <w:tc>
+          <w:tcPr/>
+          <w:p>
+            <w:pPr>
+              <w:pStyle w:val="Compact"/>
+              <w:jc w:val="right"/>
+            </w:pPr>
+            <w:r>
+              <w:t xml:space="preserve">0.0435</w:t>
             </w:r>
           </w:p>
         </w:tc>
@@ -18381,19 +18387,19 @@
               <w:jc w:val="right"/>
             </w:pPr>
             <w:r>
-              <w:t xml:space="preserve">0.438</w:t>
-            </w:r>
-          </w:p>
-        </w:tc>
-        <w:tc>
-          <w:tcPr/>
-          <w:p>
-            <w:pPr>
-              <w:pStyle w:val="Compact"/>
-              <w:jc w:val="right"/>
-            </w:pPr>
-            <w:r>
-              <w:t xml:space="preserve">0</w:t>
+              <w:t xml:space="preserve">0.425</w:t>
+            </w:r>
+          </w:p>
+        </w:tc>
+        <w:tc>
+          <w:tcPr/>
+          <w:p>
+            <w:pPr>
+              <w:pStyle w:val="Compact"/>
+              <w:jc w:val="right"/>
+            </w:pPr>
+            <w:r>
+              <w:t xml:space="preserve">0.139</w:t>
             </w:r>
           </w:p>
         </w:tc>
@@ -18443,19 +18449,19 @@
               <w:jc w:val="right"/>
             </w:pPr>
             <w:r>
-              <w:t xml:space="preserve">-0.067</w:t>
-            </w:r>
-          </w:p>
-        </w:tc>
-        <w:tc>
-          <w:tcPr/>
-          <w:p>
-            <w:pPr>
-              <w:pStyle w:val="Compact"/>
-              <w:jc w:val="right"/>
-            </w:pPr>
-            <w:r>
-              <w:t xml:space="preserve">0</w:t>
+              <w:t xml:space="preserve">-0.077</w:t>
+            </w:r>
+          </w:p>
+        </w:tc>
+        <w:tc>
+          <w:tcPr/>
+          <w:p>
+            <w:pPr>
+              <w:pStyle w:val="Compact"/>
+              <w:jc w:val="right"/>
+            </w:pPr>
+            <w:r>
+              <w:t xml:space="preserve">0.149</w:t>
             </w:r>
           </w:p>
         </w:tc>
@@ -18505,19 +18511,19 @@
               <w:jc w:val="right"/>
             </w:pPr>
             <w:r>
-              <w:t xml:space="preserve">0.555</w:t>
-            </w:r>
-          </w:p>
-        </w:tc>
-        <w:tc>
-          <w:tcPr/>
-          <w:p>
-            <w:pPr>
-              <w:pStyle w:val="Compact"/>
-              <w:jc w:val="right"/>
-            </w:pPr>
-            <w:r>
-              <w:t xml:space="preserve">0</w:t>
+              <w:t xml:space="preserve">0.535</w:t>
+            </w:r>
+          </w:p>
+        </w:tc>
+        <w:tc>
+          <w:tcPr/>
+          <w:p>
+            <w:pPr>
+              <w:pStyle w:val="Compact"/>
+              <w:jc w:val="right"/>
+            </w:pPr>
+            <w:r>
+              <w:t xml:space="preserve">0.145</w:t>
             </w:r>
           </w:p>
         </w:tc>
@@ -18567,19 +18573,19 @@
               <w:jc w:val="right"/>
             </w:pPr>
             <w:r>
-              <w:t xml:space="preserve">0.744</w:t>
-            </w:r>
-          </w:p>
-        </w:tc>
-        <w:tc>
-          <w:tcPr/>
-          <w:p>
-            <w:pPr>
-              <w:pStyle w:val="Compact"/>
-              <w:jc w:val="right"/>
-            </w:pPr>
-            <w:r>
-              <w:t xml:space="preserve">0</w:t>
+              <w:t xml:space="preserve">0.737</w:t>
+            </w:r>
+          </w:p>
+        </w:tc>
+        <w:tc>
+          <w:tcPr/>
+          <w:p>
+            <w:pPr>
+              <w:pStyle w:val="Compact"/>
+              <w:jc w:val="right"/>
+            </w:pPr>
+            <w:r>
+              <w:t xml:space="preserve">0.147</w:t>
             </w:r>
           </w:p>
         </w:tc>
@@ -18629,19 +18635,19 @@
               <w:jc w:val="right"/>
             </w:pPr>
             <w:r>
-              <w:t xml:space="preserve">-0.239</w:t>
-            </w:r>
-          </w:p>
-        </w:tc>
-        <w:tc>
-          <w:tcPr/>
-          <w:p>
-            <w:pPr>
-              <w:pStyle w:val="Compact"/>
-              <w:jc w:val="right"/>
-            </w:pPr>
-            <w:r>
-              <w:t xml:space="preserve">0</w:t>
+              <w:t xml:space="preserve">-0.261</w:t>
+            </w:r>
+          </w:p>
+        </w:tc>
+        <w:tc>
+          <w:tcPr/>
+          <w:p>
+            <w:pPr>
+              <w:pStyle w:val="Compact"/>
+              <w:jc w:val="right"/>
+            </w:pPr>
+            <w:r>
+              <w:t xml:space="preserve">0.141</w:t>
             </w:r>
           </w:p>
         </w:tc>
@@ -18691,19 +18697,19 @@
               <w:jc w:val="right"/>
             </w:pPr>
             <w:r>
-              <w:t xml:space="preserve">0.656</w:t>
-            </w:r>
-          </w:p>
-        </w:tc>
-        <w:tc>
-          <w:tcPr/>
-          <w:p>
-            <w:pPr>
-              <w:pStyle w:val="Compact"/>
-              <w:jc w:val="right"/>
-            </w:pPr>
-            <w:r>
-              <w:t xml:space="preserve">0</w:t>
+              <w:t xml:space="preserve">0.636</w:t>
+            </w:r>
+          </w:p>
+        </w:tc>
+        <w:tc>
+          <w:tcPr/>
+          <w:p>
+            <w:pPr>
+              <w:pStyle w:val="Compact"/>
+              <w:jc w:val="right"/>
+            </w:pPr>
+            <w:r>
+              <w:t xml:space="preserve">0.147</w:t>
             </w:r>
           </w:p>
         </w:tc>
@@ -18753,19 +18759,19 @@
               <w:jc w:val="right"/>
             </w:pPr>
             <w:r>
-              <w:t xml:space="preserve">0.443</w:t>
-            </w:r>
-          </w:p>
-        </w:tc>
-        <w:tc>
-          <w:tcPr/>
-          <w:p>
-            <w:pPr>
-              <w:pStyle w:val="Compact"/>
-              <w:jc w:val="right"/>
-            </w:pPr>
-            <w:r>
-              <w:t xml:space="preserve">0</w:t>
+              <w:t xml:space="preserve">0.419</w:t>
+            </w:r>
+          </w:p>
+        </w:tc>
+        <w:tc>
+          <w:tcPr/>
+          <w:p>
+            <w:pPr>
+              <w:pStyle w:val="Compact"/>
+              <w:jc w:val="right"/>
+            </w:pPr>
+            <w:r>
+              <w:t xml:space="preserve">0.141</w:t>
             </w:r>
           </w:p>
         </w:tc>
@@ -18815,19 +18821,19 @@
               <w:jc w:val="right"/>
             </w:pPr>
             <w:r>
-              <w:t xml:space="preserve">1.630</w:t>
-            </w:r>
-          </w:p>
-        </w:tc>
-        <w:tc>
-          <w:tcPr/>
-          <w:p>
-            <w:pPr>
-              <w:pStyle w:val="Compact"/>
-              <w:jc w:val="right"/>
-            </w:pPr>
-            <w:r>
-              <w:t xml:space="preserve">0</w:t>
+              <w:t xml:space="preserve">1.619</w:t>
+            </w:r>
+          </w:p>
+        </w:tc>
+        <w:tc>
+          <w:tcPr/>
+          <w:p>
+            <w:pPr>
+              <w:pStyle w:val="Compact"/>
+              <w:jc w:val="right"/>
+            </w:pPr>
+            <w:r>
+              <w:t xml:space="preserve">0.157</w:t>
             </w:r>
           </w:p>
         </w:tc>
@@ -18877,19 +18883,19 @@
               <w:jc w:val="right"/>
             </w:pPr>
             <w:r>
-              <w:t xml:space="preserve">0.236</w:t>
-            </w:r>
-          </w:p>
-        </w:tc>
-        <w:tc>
-          <w:tcPr/>
-          <w:p>
-            <w:pPr>
-              <w:pStyle w:val="Compact"/>
-              <w:jc w:val="right"/>
-            </w:pPr>
-            <w:r>
-              <w:t xml:space="preserve">0</w:t>
+              <w:t xml:space="preserve">0.211</w:t>
+            </w:r>
+          </w:p>
+        </w:tc>
+        <w:tc>
+          <w:tcPr/>
+          <w:p>
+            <w:pPr>
+              <w:pStyle w:val="Compact"/>
+              <w:jc w:val="right"/>
+            </w:pPr>
+            <w:r>
+              <w:t xml:space="preserve">0.143</w:t>
             </w:r>
           </w:p>
         </w:tc>
@@ -19836,7 +19842,7 @@
               <w:jc w:val="right"/>
             </w:pPr>
             <w:r>
-              <w:t xml:space="preserve">0.2839</w:t>
+              <w:t xml:space="preserve">0.2847</w:t>
             </w:r>
           </w:p>
         </w:tc>
@@ -19922,7 +19928,7 @@
               <w:jc w:val="right"/>
             </w:pPr>
             <w:r>
-              <w:t xml:space="preserve">0.1171</w:t>
+              <w:t xml:space="preserve">0.1179</w:t>
             </w:r>
           </w:p>
         </w:tc>
@@ -20008,7 +20014,7 @@
               <w:jc w:val="right"/>
             </w:pPr>
             <w:r>
-              <w:t xml:space="preserve">0.1072</w:t>
+              <w:t xml:space="preserve">0.1066</w:t>
             </w:r>
           </w:p>
         </w:tc>
@@ -20094,7 +20100,7 @@
               <w:jc w:val="right"/>
             </w:pPr>
             <w:r>
-              <w:t xml:space="preserve">0.0969</w:t>
+              <w:t xml:space="preserve">0.0964</w:t>
             </w:r>
           </w:p>
         </w:tc>
@@ -20180,19 +20186,19 @@
               <w:jc w:val="right"/>
             </w:pPr>
             <w:r>
-              <w:t xml:space="preserve">0.0867</w:t>
-            </w:r>
-          </w:p>
-        </w:tc>
-        <w:tc>
-          <w:tcPr/>
-          <w:p>
-            <w:pPr>
-              <w:pStyle w:val="Compact"/>
-              <w:jc w:val="right"/>
-            </w:pPr>
-            <w:r>
-              <w:t xml:space="preserve">5</w:t>
+              <w:t xml:space="preserve">0.0859</w:t>
+            </w:r>
+          </w:p>
+        </w:tc>
+        <w:tc>
+          <w:tcPr/>
+          <w:p>
+            <w:pPr>
+              <w:pStyle w:val="Compact"/>
+              <w:jc w:val="right"/>
+            </w:pPr>
+            <w:r>
+              <w:t xml:space="preserve">6</w:t>
             </w:r>
           </w:p>
         </w:tc>
@@ -20266,19 +20272,19 @@
               <w:jc w:val="right"/>
             </w:pPr>
             <w:r>
-              <w:t xml:space="preserve">0.0862</w:t>
-            </w:r>
-          </w:p>
-        </w:tc>
-        <w:tc>
-          <w:tcPr/>
-          <w:p>
-            <w:pPr>
-              <w:pStyle w:val="Compact"/>
-              <w:jc w:val="right"/>
-            </w:pPr>
-            <w:r>
-              <w:t xml:space="preserve">6</w:t>
+              <w:t xml:space="preserve">0.0863</w:t>
+            </w:r>
+          </w:p>
+        </w:tc>
+        <w:tc>
+          <w:tcPr/>
+          <w:p>
+            <w:pPr>
+              <w:pStyle w:val="Compact"/>
+              <w:jc w:val="right"/>
+            </w:pPr>
+            <w:r>
+              <w:t xml:space="preserve">5</w:t>
             </w:r>
           </w:p>
         </w:tc>
@@ -20352,7 +20358,7 @@
               <w:jc w:val="right"/>
             </w:pPr>
             <w:r>
-              <w:t xml:space="preserve">0.0704</w:t>
+              <w:t xml:space="preserve">0.0698</w:t>
             </w:r>
           </w:p>
         </w:tc>
@@ -20438,7 +20444,7 @@
               <w:jc w:val="right"/>
             </w:pPr>
             <w:r>
-              <w:t xml:space="preserve">0.0556</w:t>
+              <w:t xml:space="preserve">0.0565</w:t>
             </w:r>
           </w:p>
         </w:tc>
@@ -20524,7 +20530,7 @@
               <w:jc w:val="right"/>
             </w:pPr>
             <w:r>
-              <w:t xml:space="preserve">0.0520</w:t>
+              <w:t xml:space="preserve">0.0523</w:t>
             </w:r>
           </w:p>
         </w:tc>
@@ -20610,7 +20616,7 @@
               <w:jc w:val="right"/>
             </w:pPr>
             <w:r>
-              <w:t xml:space="preserve">0.0438</w:t>
+              <w:t xml:space="preserve">0.0435</w:t>
             </w:r>
           </w:p>
         </w:tc>
@@ -22572,7 +22578,7 @@
         <w:pStyle w:val="FirstParagraph"/>
       </w:pPr>
       <w:r>
-        <w:t xml:space="preserve">Across all three methods, the analysis reveals a consistent and interpretable preference hierarchy among the 10 MSBA core classes at UCSD Rady. MGTA 495 Marketing Analytics ranks first by a substantial margin (counts score 0.567, MLE share 0.284), suggesting students strongly value applied, career-facing analytics coursework. MGTA 453 Business Analytics and MGTA 455 Customer Analytics follow in second and third place. At the bottom, MGTA 444 Analytics Consulting (counts score −0.155) and MGTA 451 Marketing/Finance/Operations rank as the least preferred — perhaps because students perceive them as less analytically distinctive or more obligatory in nature.</w:t>
+        <w:t xml:space="preserve">Across all three methods, the analysis reveals a consistent and interpretable preference hierarchy among the 10 MSBA core classes at UCSD Rady. MGTA 495 Marketing Analytics ranks first by a substantial margin (counts score 0.493, MLE share 0.284), suggesting students strongly value applied, career-facing analytics coursework. MGTA 453 Business Analytics and MGTA 455 Customer Analytics follow in second and third place. At the bottom, MGTA 444 Analytics Consulting (counts score −0.292) and MGTA 451 Marketing/Finance/Operations rank as the least preferred — perhaps because students perceive them as less analytically distinctive or more obligatory in nature.</w:t>
       </w:r>
     </w:p>
     <w:p>

</xml_diff>